<commit_message>
Place PPT screenshots under related section content in Word docs
Move evidence images inline beneath each section's bullet points
instead of listing them in a separate screenshot appendix.

Co-authored-by: Annie <Annie-Summer@users.noreply.github.com>
</commit_message>
<xml_diff>
--- a/yunqi-2026-cipu-forum/docs/01-CIPU技术深度解读-杨航.docx
+++ b/yunqi-2026-cipu-forum/docs/01-CIPU技术深度解读-杨航.docx
@@ -269,12 +269,118 @@
           <w:b/>
           <w:sz w:val="26"/>
         </w:rPr>
-        <w:t>三、分节梳理</w:t>
+        <w:t>三、分节梳理与PPT佐证</w:t>
       </w:r>
     </w:p>
     <w:p>
       <w:pPr>
         <w:spacing w:after="120" w:line="300" w:lineRule="auto"/>
+      </w:pPr>
+      <w:r>
+        <w:rPr>
+          <w:rFonts w:ascii="微软雅黑" w:hAnsi="微软雅黑" w:eastAsia="微软雅黑"/>
+          <w:b w:val="0"/>
+          <w:sz w:val="20"/>
+        </w:rPr>
+        <w:t>以下按议题结构展开；每节文字要点之后立即附上对应 PPT 截图作为佐证。</w:t>
+      </w:r>
+    </w:p>
+    <w:p>
+      <w:pPr>
+        <w:spacing w:after="80" w:line="300" w:lineRule="auto"/>
+      </w:pPr>
+      <w:r>
+        <w:rPr>
+          <w:rFonts w:ascii="微软雅黑" w:hAnsi="微软雅黑" w:eastAsia="微软雅黑"/>
+          <w:b/>
+          <w:sz w:val="24"/>
+        </w:rPr>
+        <w:t>嘉宾与开场</w:t>
+      </w:r>
+    </w:p>
+    <w:p>
+      <w:pPr>
+        <w:pStyle w:val="ListBullet"/>
+        <w:spacing w:after="60"/>
+      </w:pPr>
+      <w:r>
+        <w:rPr>
+          <w:rFonts w:ascii="微软雅黑" w:hAnsi="微软雅黑" w:eastAsia="微软雅黑"/>
+          <w:b w:val="0"/>
+          <w:sz w:val="22"/>
+        </w:rPr>
+        <w:t>本场开场确认讲者身份与议题。</w:t>
+      </w:r>
+    </w:p>
+    <w:p>
+      <w:pPr>
+        <w:jc w:val="center"/>
+      </w:pPr>
+      <w:r>
+        <w:drawing>
+          <wp:inline xmlns:a="http://schemas.openxmlformats.org/drawingml/2006/main" xmlns:pic="http://schemas.openxmlformats.org/drawingml/2006/picture">
+            <wp:extent cx="5303520" cy="2524814"/>
+            <wp:docPr id="1" name="Picture 1"/>
+            <wp:cNvGraphicFramePr>
+              <a:graphicFrameLocks noChangeAspect="1"/>
+            </wp:cNvGraphicFramePr>
+            <a:graphic>
+              <a:graphicData uri="http://schemas.openxmlformats.org/drawingml/2006/picture">
+                <pic:pic>
+                  <pic:nvPicPr>
+                    <pic:cNvPr id="0" name="t00-02-07.png"/>
+                    <pic:cNvPicPr/>
+                  </pic:nvPicPr>
+                  <pic:blipFill>
+                    <a:blip r:embed="rId9"/>
+                    <a:stretch>
+                      <a:fillRect/>
+                    </a:stretch>
+                  </pic:blipFill>
+                  <pic:spPr>
+                    <a:xfrm>
+                      <a:off x="0" y="0"/>
+                      <a:ext cx="5303520" cy="2524814"/>
+                    </a:xfrm>
+                    <a:prstGeom prst="rect"/>
+                  </pic:spPr>
+                </pic:pic>
+              </a:graphicData>
+            </a:graphic>
+          </wp:inline>
+        </w:drawing>
+      </w:r>
+    </w:p>
+    <w:p>
+      <w:pPr>
+        <w:jc w:val="center"/>
+      </w:pPr>
+      <w:r>
+        <w:rPr>
+          <w:rFonts w:ascii="微软雅黑" w:hAnsi="微软雅黑" w:eastAsia="微软雅黑"/>
+          <w:b w:val="0"/>
+          <w:color w:val="5A5A5A"/>
+          <w:sz w:val="18"/>
+        </w:rPr>
+        <w:t>图1 嘉宾介绍：杨航 / Hang Yang</w:t>
+      </w:r>
+    </w:p>
+    <w:p>
+      <w:pPr>
+        <w:spacing w:after="200" w:line="300" w:lineRule="auto"/>
+      </w:pPr>
+      <w:r>
+        <w:rPr>
+          <w:rFonts w:ascii="微软雅黑" w:hAnsi="微软雅黑" w:eastAsia="微软雅黑"/>
+          <w:b w:val="0"/>
+          <w:sz w:val="20"/>
+        </w:rPr>
+        <w:t>佐证说明：确认讲者身份与开场时间。</w:t>
+      </w:r>
+    </w:p>
+    <w:p>
+      <w:pPr>
+        <w:spacing w:after="80" w:line="300" w:lineRule="auto"/>
       </w:pPr>
       <w:r>
         <w:rPr>
@@ -315,7 +421,139 @@
     </w:p>
     <w:p>
       <w:pPr>
-        <w:spacing w:after="120" w:line="300" w:lineRule="auto"/>
+        <w:jc w:val="center"/>
+      </w:pPr>
+      <w:r>
+        <w:drawing>
+          <wp:inline xmlns:a="http://schemas.openxmlformats.org/drawingml/2006/main" xmlns:pic="http://schemas.openxmlformats.org/drawingml/2006/picture">
+            <wp:extent cx="5303520" cy="2524814"/>
+            <wp:docPr id="2" name="Picture 2"/>
+            <wp:cNvGraphicFramePr>
+              <a:graphicFrameLocks noChangeAspect="1"/>
+            </wp:cNvGraphicFramePr>
+            <a:graphic>
+              <a:graphicData uri="http://schemas.openxmlformats.org/drawingml/2006/picture">
+                <pic:pic>
+                  <pic:nvPicPr>
+                    <pic:cNvPr id="0" name="t00-07-30.png"/>
+                    <pic:cNvPicPr/>
+                  </pic:nvPicPr>
+                  <pic:blipFill>
+                    <a:blip r:embed="rId10"/>
+                    <a:stretch>
+                      <a:fillRect/>
+                    </a:stretch>
+                  </pic:blipFill>
+                  <pic:spPr>
+                    <a:xfrm>
+                      <a:off x="0" y="0"/>
+                      <a:ext cx="5303520" cy="2524814"/>
+                    </a:xfrm>
+                    <a:prstGeom prst="rect"/>
+                  </pic:spPr>
+                </pic:pic>
+              </a:graphicData>
+            </a:graphic>
+          </wp:inline>
+        </w:drawing>
+      </w:r>
+    </w:p>
+    <w:p>
+      <w:pPr>
+        <w:jc w:val="center"/>
+      </w:pPr>
+      <w:r>
+        <w:rPr>
+          <w:rFonts w:ascii="微软雅黑" w:hAnsi="微软雅黑" w:eastAsia="微软雅黑"/>
+          <w:b w:val="0"/>
+          <w:color w:val="5A5A5A"/>
+          <w:sz w:val="18"/>
+        </w:rPr>
+        <w:t>图2 云计算核心价值六要素</w:t>
+      </w:r>
+    </w:p>
+    <w:p>
+      <w:pPr>
+        <w:spacing w:after="200" w:line="300" w:lineRule="auto"/>
+      </w:pPr>
+      <w:r>
+        <w:rPr>
+          <w:rFonts w:ascii="微软雅黑" w:hAnsi="微软雅黑" w:eastAsia="微软雅黑"/>
+          <w:b w:val="0"/>
+          <w:sz w:val="20"/>
+        </w:rPr>
+        <w:t>佐证说明：强调无多租安全隔离则其他价值归零。</w:t>
+      </w:r>
+    </w:p>
+    <w:p>
+      <w:pPr>
+        <w:jc w:val="center"/>
+      </w:pPr>
+      <w:r>
+        <w:drawing>
+          <wp:inline xmlns:a="http://schemas.openxmlformats.org/drawingml/2006/main" xmlns:pic="http://schemas.openxmlformats.org/drawingml/2006/picture">
+            <wp:extent cx="5303520" cy="2524814"/>
+            <wp:docPr id="3" name="Picture 3"/>
+            <wp:cNvGraphicFramePr>
+              <a:graphicFrameLocks noChangeAspect="1"/>
+            </wp:cNvGraphicFramePr>
+            <a:graphic>
+              <a:graphicData uri="http://schemas.openxmlformats.org/drawingml/2006/picture">
+                <pic:pic>
+                  <pic:nvPicPr>
+                    <pic:cNvPr id="0" name="t00-08-20.png"/>
+                    <pic:cNvPicPr/>
+                  </pic:nvPicPr>
+                  <pic:blipFill>
+                    <a:blip r:embed="rId11"/>
+                    <a:stretch>
+                      <a:fillRect/>
+                    </a:stretch>
+                  </pic:blipFill>
+                  <pic:spPr>
+                    <a:xfrm>
+                      <a:off x="0" y="0"/>
+                      <a:ext cx="5303520" cy="2524814"/>
+                    </a:xfrm>
+                    <a:prstGeom prst="rect"/>
+                  </pic:spPr>
+                </pic:pic>
+              </a:graphicData>
+            </a:graphic>
+          </wp:inline>
+        </w:drawing>
+      </w:r>
+    </w:p>
+    <w:p>
+      <w:pPr>
+        <w:jc w:val="center"/>
+      </w:pPr>
+      <w:r>
+        <w:rPr>
+          <w:rFonts w:ascii="微软雅黑" w:hAnsi="微软雅黑" w:eastAsia="微软雅黑"/>
+          <w:b w:val="0"/>
+          <w:color w:val="5A5A5A"/>
+          <w:sz w:val="18"/>
+        </w:rPr>
+        <w:t>图3 传统 KVM vs CIPU 虚拟化架构</w:t>
+      </w:r>
+    </w:p>
+    <w:p>
+      <w:pPr>
+        <w:spacing w:after="200" w:line="300" w:lineRule="auto"/>
+      </w:pPr>
+      <w:r>
+        <w:rPr>
+          <w:rFonts w:ascii="微软雅黑" w:hAnsi="微软雅黑" w:eastAsia="微软雅黑"/>
+          <w:b w:val="0"/>
+          <w:sz w:val="20"/>
+        </w:rPr>
+        <w:t>佐证说明：Dom0 下沉 CIPU，硬件直通 IO + 数据访问加速。</w:t>
+      </w:r>
+    </w:p>
+    <w:p>
+      <w:pPr>
+        <w:spacing w:after="80" w:line="300" w:lineRule="auto"/>
       </w:pPr>
       <w:r>
         <w:rPr>
@@ -356,7 +594,180 @@
     </w:p>
     <w:p>
       <w:pPr>
-        <w:spacing w:after="120" w:line="300" w:lineRule="auto"/>
+        <w:jc w:val="center"/>
+      </w:pPr>
+      <w:r>
+        <w:drawing>
+          <wp:inline xmlns:a="http://schemas.openxmlformats.org/drawingml/2006/main" xmlns:pic="http://schemas.openxmlformats.org/drawingml/2006/picture">
+            <wp:extent cx="5303520" cy="2524814"/>
+            <wp:docPr id="4" name="Picture 4"/>
+            <wp:cNvGraphicFramePr>
+              <a:graphicFrameLocks noChangeAspect="1"/>
+            </wp:cNvGraphicFramePr>
+            <a:graphic>
+              <a:graphicData uri="http://schemas.openxmlformats.org/drawingml/2006/picture">
+                <pic:pic>
+                  <pic:nvPicPr>
+                    <pic:cNvPr id="0" name="t00-10-50.png"/>
+                    <pic:cNvPicPr/>
+                  </pic:nvPicPr>
+                  <pic:blipFill>
+                    <a:blip r:embed="rId12"/>
+                    <a:stretch>
+                      <a:fillRect/>
+                    </a:stretch>
+                  </pic:blipFill>
+                  <pic:spPr>
+                    <a:xfrm>
+                      <a:off x="0" y="0"/>
+                      <a:ext cx="5303520" cy="2524814"/>
+                    </a:xfrm>
+                    <a:prstGeom prst="rect"/>
+                  </pic:spPr>
+                </pic:pic>
+              </a:graphicData>
+            </a:graphic>
+          </wp:inline>
+        </w:drawing>
+      </w:r>
+    </w:p>
+    <w:p>
+      <w:pPr>
+        <w:jc w:val="center"/>
+      </w:pPr>
+      <w:r>
+        <w:rPr>
+          <w:rFonts w:ascii="微软雅黑" w:hAnsi="微软雅黑" w:eastAsia="微软雅黑"/>
+          <w:b w:val="0"/>
+          <w:color w:val="5A5A5A"/>
+          <w:sz w:val="18"/>
+        </w:rPr>
+        <w:t>图4 CIPU 五代演进时间线</w:t>
+      </w:r>
+    </w:p>
+    <w:p>
+      <w:pPr>
+        <w:spacing w:after="200" w:line="300" w:lineRule="auto"/>
+      </w:pPr>
+      <w:r>
+        <w:rPr>
+          <w:rFonts w:ascii="微软雅黑" w:hAnsi="微软雅黑" w:eastAsia="微软雅黑"/>
+          <w:b w:val="0"/>
+          <w:sz w:val="20"/>
+        </w:rPr>
+        <w:t>佐证说明：第五代 2×200GbE + CPFS/加密/TPM。</w:t>
+      </w:r>
+    </w:p>
+    <w:p>
+      <w:pPr>
+        <w:spacing w:after="80" w:line="300" w:lineRule="auto"/>
+      </w:pPr>
+      <w:r>
+        <w:rPr>
+          <w:rFonts w:ascii="微软雅黑" w:hAnsi="微软雅黑" w:eastAsia="微软雅黑"/>
+          <w:b/>
+          <w:sz w:val="24"/>
+        </w:rPr>
+        <w:t>AI 安全与性能挑战</w:t>
+      </w:r>
+    </w:p>
+    <w:p>
+      <w:pPr>
+        <w:pStyle w:val="ListBullet"/>
+        <w:spacing w:after="60"/>
+      </w:pPr>
+      <w:r>
+        <w:rPr>
+          <w:rFonts w:ascii="微软雅黑" w:hAnsi="微软雅黑" w:eastAsia="微软雅黑"/>
+          <w:b w:val="0"/>
+          <w:sz w:val="22"/>
+        </w:rPr>
+        <w:t>AI 语境强调多租安全是底线，并引用 Agent 沙箱逃逸与 Neocloud 安全不足作为背景。</w:t>
+      </w:r>
+    </w:p>
+    <w:p>
+      <w:pPr>
+        <w:pStyle w:val="ListBullet"/>
+        <w:spacing w:after="60"/>
+      </w:pPr>
+      <w:r>
+        <w:rPr>
+          <w:rFonts w:ascii="微软雅黑" w:hAnsi="微软雅黑" w:eastAsia="微软雅黑"/>
+          <w:b w:val="0"/>
+          <w:sz w:val="22"/>
+        </w:rPr>
+        <w:t>能耗视角：DRAM 访问能量远高于算力操作，瓶颈转向内存墙与跨服务器互联/存储。</w:t>
+      </w:r>
+    </w:p>
+    <w:p>
+      <w:pPr>
+        <w:jc w:val="center"/>
+      </w:pPr>
+      <w:r>
+        <w:drawing>
+          <wp:inline xmlns:a="http://schemas.openxmlformats.org/drawingml/2006/main" xmlns:pic="http://schemas.openxmlformats.org/drawingml/2006/picture">
+            <wp:extent cx="5303520" cy="2524814"/>
+            <wp:docPr id="5" name="Picture 5"/>
+            <wp:cNvGraphicFramePr>
+              <a:graphicFrameLocks noChangeAspect="1"/>
+            </wp:cNvGraphicFramePr>
+            <a:graphic>
+              <a:graphicData uri="http://schemas.openxmlformats.org/drawingml/2006/picture">
+                <pic:pic>
+                  <pic:nvPicPr>
+                    <pic:cNvPr id="0" name="t00-15-00.png"/>
+                    <pic:cNvPicPr/>
+                  </pic:nvPicPr>
+                  <pic:blipFill>
+                    <a:blip r:embed="rId13"/>
+                    <a:stretch>
+                      <a:fillRect/>
+                    </a:stretch>
+                  </pic:blipFill>
+                  <pic:spPr>
+                    <a:xfrm>
+                      <a:off x="0" y="0"/>
+                      <a:ext cx="5303520" cy="2524814"/>
+                    </a:xfrm>
+                    <a:prstGeom prst="rect"/>
+                  </pic:spPr>
+                </pic:pic>
+              </a:graphicData>
+            </a:graphic>
+          </wp:inline>
+        </w:drawing>
+      </w:r>
+    </w:p>
+    <w:p>
+      <w:pPr>
+        <w:jc w:val="center"/>
+      </w:pPr>
+      <w:r>
+        <w:rPr>
+          <w:rFonts w:ascii="微软雅黑" w:hAnsi="微软雅黑" w:eastAsia="微软雅黑"/>
+          <w:b w:val="0"/>
+          <w:color w:val="5A5A5A"/>
+          <w:sz w:val="18"/>
+        </w:rPr>
+        <w:t>图5 AI 基础设施安全与性能挑战</w:t>
+      </w:r>
+    </w:p>
+    <w:p>
+      <w:pPr>
+        <w:spacing w:after="200" w:line="300" w:lineRule="auto"/>
+      </w:pPr>
+      <w:r>
+        <w:rPr>
+          <w:rFonts w:ascii="微软雅黑" w:hAnsi="微软雅黑" w:eastAsia="微软雅黑"/>
+          <w:b w:val="0"/>
+          <w:sz w:val="20"/>
+        </w:rPr>
+        <w:t>佐证说明：数据访问远贵于计算，瓶颈在内存墙与互联。</w:t>
+      </w:r>
+    </w:p>
+    <w:p>
+      <w:pPr>
+        <w:spacing w:after="80" w:line="300" w:lineRule="auto"/>
       </w:pPr>
       <w:r>
         <w:rPr>
@@ -425,362 +836,6 @@
     </w:p>
     <w:p>
       <w:pPr>
-        <w:pStyle w:val="Heading2"/>
-      </w:pPr>
-      <w:r>
-        <w:rPr>
-          <w:rFonts w:ascii="微软雅黑" w:hAnsi="微软雅黑" w:eastAsia="微软雅黑"/>
-          <w:b/>
-          <w:sz w:val="26"/>
-        </w:rPr>
-        <w:t>四、PPT截图佐证</w:t>
-      </w:r>
-    </w:p>
-    <w:p>
-      <w:pPr>
-        <w:spacing w:after="120" w:line="300" w:lineRule="auto"/>
-      </w:pPr>
-      <w:r>
-        <w:rPr>
-          <w:rFonts w:ascii="微软雅黑" w:hAnsi="微软雅黑" w:eastAsia="微软雅黑"/>
-          <w:b w:val="0"/>
-          <w:sz w:val="22"/>
-        </w:rPr>
-        <w:t>以下截图取自官方回放视频对应时间点，用于佐证上述要点。</w:t>
-      </w:r>
-    </w:p>
-    <w:p>
-      <w:pPr>
-        <w:jc w:val="center"/>
-      </w:pPr>
-      <w:r>
-        <w:drawing>
-          <wp:inline xmlns:a="http://schemas.openxmlformats.org/drawingml/2006/main" xmlns:pic="http://schemas.openxmlformats.org/drawingml/2006/picture">
-            <wp:extent cx="5303520" cy="2524814"/>
-            <wp:docPr id="1" name="Picture 1"/>
-            <wp:cNvGraphicFramePr>
-              <a:graphicFrameLocks noChangeAspect="1"/>
-            </wp:cNvGraphicFramePr>
-            <a:graphic>
-              <a:graphicData uri="http://schemas.openxmlformats.org/drawingml/2006/picture">
-                <pic:pic>
-                  <pic:nvPicPr>
-                    <pic:cNvPr id="0" name="t00-02-07.png"/>
-                    <pic:cNvPicPr/>
-                  </pic:nvPicPr>
-                  <pic:blipFill>
-                    <a:blip r:embed="rId9"/>
-                    <a:stretch>
-                      <a:fillRect/>
-                    </a:stretch>
-                  </pic:blipFill>
-                  <pic:spPr>
-                    <a:xfrm>
-                      <a:off x="0" y="0"/>
-                      <a:ext cx="5303520" cy="2524814"/>
-                    </a:xfrm>
-                    <a:prstGeom prst="rect"/>
-                  </pic:spPr>
-                </pic:pic>
-              </a:graphicData>
-            </a:graphic>
-          </wp:inline>
-        </w:drawing>
-      </w:r>
-    </w:p>
-    <w:p>
-      <w:pPr>
-        <w:jc w:val="center"/>
-      </w:pPr>
-      <w:r>
-        <w:rPr>
-          <w:rFonts w:ascii="微软雅黑" w:hAnsi="微软雅黑" w:eastAsia="微软雅黑"/>
-          <w:b w:val="0"/>
-          <w:color w:val="5A5A5A"/>
-          <w:sz w:val="18"/>
-        </w:rPr>
-        <w:t>图1 嘉宾介绍：杨航 / Hang Yang</w:t>
-      </w:r>
-    </w:p>
-    <w:p>
-      <w:pPr>
-        <w:spacing w:after="120" w:line="300" w:lineRule="auto"/>
-      </w:pPr>
-      <w:r>
-        <w:rPr>
-          <w:rFonts w:ascii="微软雅黑" w:hAnsi="微软雅黑" w:eastAsia="微软雅黑"/>
-          <w:b w:val="0"/>
-          <w:sz w:val="22"/>
-        </w:rPr>
-        <w:t>确认讲者身份与开场时间。</w:t>
-      </w:r>
-    </w:p>
-    <w:p>
-      <w:pPr>
-        <w:jc w:val="center"/>
-      </w:pPr>
-      <w:r>
-        <w:drawing>
-          <wp:inline xmlns:a="http://schemas.openxmlformats.org/drawingml/2006/main" xmlns:pic="http://schemas.openxmlformats.org/drawingml/2006/picture">
-            <wp:extent cx="5303520" cy="2524814"/>
-            <wp:docPr id="2" name="Picture 2"/>
-            <wp:cNvGraphicFramePr>
-              <a:graphicFrameLocks noChangeAspect="1"/>
-            </wp:cNvGraphicFramePr>
-            <a:graphic>
-              <a:graphicData uri="http://schemas.openxmlformats.org/drawingml/2006/picture">
-                <pic:pic>
-                  <pic:nvPicPr>
-                    <pic:cNvPr id="0" name="t00-07-30.png"/>
-                    <pic:cNvPicPr/>
-                  </pic:nvPicPr>
-                  <pic:blipFill>
-                    <a:blip r:embed="rId10"/>
-                    <a:stretch>
-                      <a:fillRect/>
-                    </a:stretch>
-                  </pic:blipFill>
-                  <pic:spPr>
-                    <a:xfrm>
-                      <a:off x="0" y="0"/>
-                      <a:ext cx="5303520" cy="2524814"/>
-                    </a:xfrm>
-                    <a:prstGeom prst="rect"/>
-                  </pic:spPr>
-                </pic:pic>
-              </a:graphicData>
-            </a:graphic>
-          </wp:inline>
-        </w:drawing>
-      </w:r>
-    </w:p>
-    <w:p>
-      <w:pPr>
-        <w:jc w:val="center"/>
-      </w:pPr>
-      <w:r>
-        <w:rPr>
-          <w:rFonts w:ascii="微软雅黑" w:hAnsi="微软雅黑" w:eastAsia="微软雅黑"/>
-          <w:b w:val="0"/>
-          <w:color w:val="5A5A5A"/>
-          <w:sz w:val="18"/>
-        </w:rPr>
-        <w:t>图2 云计算核心价值六要素</w:t>
-      </w:r>
-    </w:p>
-    <w:p>
-      <w:pPr>
-        <w:spacing w:after="120" w:line="300" w:lineRule="auto"/>
-      </w:pPr>
-      <w:r>
-        <w:rPr>
-          <w:rFonts w:ascii="微软雅黑" w:hAnsi="微软雅黑" w:eastAsia="微软雅黑"/>
-          <w:b w:val="0"/>
-          <w:sz w:val="22"/>
-        </w:rPr>
-        <w:t>强调无多租安全隔离则其他价值归零。</w:t>
-      </w:r>
-    </w:p>
-    <w:p>
-      <w:pPr>
-        <w:jc w:val="center"/>
-      </w:pPr>
-      <w:r>
-        <w:drawing>
-          <wp:inline xmlns:a="http://schemas.openxmlformats.org/drawingml/2006/main" xmlns:pic="http://schemas.openxmlformats.org/drawingml/2006/picture">
-            <wp:extent cx="5303520" cy="2524814"/>
-            <wp:docPr id="3" name="Picture 3"/>
-            <wp:cNvGraphicFramePr>
-              <a:graphicFrameLocks noChangeAspect="1"/>
-            </wp:cNvGraphicFramePr>
-            <a:graphic>
-              <a:graphicData uri="http://schemas.openxmlformats.org/drawingml/2006/picture">
-                <pic:pic>
-                  <pic:nvPicPr>
-                    <pic:cNvPr id="0" name="t00-08-20.png"/>
-                    <pic:cNvPicPr/>
-                  </pic:nvPicPr>
-                  <pic:blipFill>
-                    <a:blip r:embed="rId11"/>
-                    <a:stretch>
-                      <a:fillRect/>
-                    </a:stretch>
-                  </pic:blipFill>
-                  <pic:spPr>
-                    <a:xfrm>
-                      <a:off x="0" y="0"/>
-                      <a:ext cx="5303520" cy="2524814"/>
-                    </a:xfrm>
-                    <a:prstGeom prst="rect"/>
-                  </pic:spPr>
-                </pic:pic>
-              </a:graphicData>
-            </a:graphic>
-          </wp:inline>
-        </w:drawing>
-      </w:r>
-    </w:p>
-    <w:p>
-      <w:pPr>
-        <w:jc w:val="center"/>
-      </w:pPr>
-      <w:r>
-        <w:rPr>
-          <w:rFonts w:ascii="微软雅黑" w:hAnsi="微软雅黑" w:eastAsia="微软雅黑"/>
-          <w:b w:val="0"/>
-          <w:color w:val="5A5A5A"/>
-          <w:sz w:val="18"/>
-        </w:rPr>
-        <w:t>图3 传统 KVM vs CIPU 虚拟化架构</w:t>
-      </w:r>
-    </w:p>
-    <w:p>
-      <w:pPr>
-        <w:spacing w:after="120" w:line="300" w:lineRule="auto"/>
-      </w:pPr>
-      <w:r>
-        <w:rPr>
-          <w:rFonts w:ascii="微软雅黑" w:hAnsi="微软雅黑" w:eastAsia="微软雅黑"/>
-          <w:b w:val="0"/>
-          <w:sz w:val="22"/>
-        </w:rPr>
-        <w:t>Dom0 下沉 CIPU，硬件直通 IO + 数据访问加速。</w:t>
-      </w:r>
-    </w:p>
-    <w:p>
-      <w:pPr>
-        <w:jc w:val="center"/>
-      </w:pPr>
-      <w:r>
-        <w:drawing>
-          <wp:inline xmlns:a="http://schemas.openxmlformats.org/drawingml/2006/main" xmlns:pic="http://schemas.openxmlformats.org/drawingml/2006/picture">
-            <wp:extent cx="5303520" cy="2524814"/>
-            <wp:docPr id="4" name="Picture 4"/>
-            <wp:cNvGraphicFramePr>
-              <a:graphicFrameLocks noChangeAspect="1"/>
-            </wp:cNvGraphicFramePr>
-            <a:graphic>
-              <a:graphicData uri="http://schemas.openxmlformats.org/drawingml/2006/picture">
-                <pic:pic>
-                  <pic:nvPicPr>
-                    <pic:cNvPr id="0" name="t00-10-50.png"/>
-                    <pic:cNvPicPr/>
-                  </pic:nvPicPr>
-                  <pic:blipFill>
-                    <a:blip r:embed="rId12"/>
-                    <a:stretch>
-                      <a:fillRect/>
-                    </a:stretch>
-                  </pic:blipFill>
-                  <pic:spPr>
-                    <a:xfrm>
-                      <a:off x="0" y="0"/>
-                      <a:ext cx="5303520" cy="2524814"/>
-                    </a:xfrm>
-                    <a:prstGeom prst="rect"/>
-                  </pic:spPr>
-                </pic:pic>
-              </a:graphicData>
-            </a:graphic>
-          </wp:inline>
-        </w:drawing>
-      </w:r>
-    </w:p>
-    <w:p>
-      <w:pPr>
-        <w:jc w:val="center"/>
-      </w:pPr>
-      <w:r>
-        <w:rPr>
-          <w:rFonts w:ascii="微软雅黑" w:hAnsi="微软雅黑" w:eastAsia="微软雅黑"/>
-          <w:b w:val="0"/>
-          <w:color w:val="5A5A5A"/>
-          <w:sz w:val="18"/>
-        </w:rPr>
-        <w:t>图4 CIPU 五代演进时间线</w:t>
-      </w:r>
-    </w:p>
-    <w:p>
-      <w:pPr>
-        <w:spacing w:after="120" w:line="300" w:lineRule="auto"/>
-      </w:pPr>
-      <w:r>
-        <w:rPr>
-          <w:rFonts w:ascii="微软雅黑" w:hAnsi="微软雅黑" w:eastAsia="微软雅黑"/>
-          <w:b w:val="0"/>
-          <w:sz w:val="22"/>
-        </w:rPr>
-        <w:t>第五代 2×200GbE + CPFS/加密/TPM。</w:t>
-      </w:r>
-    </w:p>
-    <w:p>
-      <w:pPr>
-        <w:jc w:val="center"/>
-      </w:pPr>
-      <w:r>
-        <w:drawing>
-          <wp:inline xmlns:a="http://schemas.openxmlformats.org/drawingml/2006/main" xmlns:pic="http://schemas.openxmlformats.org/drawingml/2006/picture">
-            <wp:extent cx="5303520" cy="2524814"/>
-            <wp:docPr id="5" name="Picture 5"/>
-            <wp:cNvGraphicFramePr>
-              <a:graphicFrameLocks noChangeAspect="1"/>
-            </wp:cNvGraphicFramePr>
-            <a:graphic>
-              <a:graphicData uri="http://schemas.openxmlformats.org/drawingml/2006/picture">
-                <pic:pic>
-                  <pic:nvPicPr>
-                    <pic:cNvPr id="0" name="t00-15-00.png"/>
-                    <pic:cNvPicPr/>
-                  </pic:nvPicPr>
-                  <pic:blipFill>
-                    <a:blip r:embed="rId13"/>
-                    <a:stretch>
-                      <a:fillRect/>
-                    </a:stretch>
-                  </pic:blipFill>
-                  <pic:spPr>
-                    <a:xfrm>
-                      <a:off x="0" y="0"/>
-                      <a:ext cx="5303520" cy="2524814"/>
-                    </a:xfrm>
-                    <a:prstGeom prst="rect"/>
-                  </pic:spPr>
-                </pic:pic>
-              </a:graphicData>
-            </a:graphic>
-          </wp:inline>
-        </w:drawing>
-      </w:r>
-    </w:p>
-    <w:p>
-      <w:pPr>
-        <w:jc w:val="center"/>
-      </w:pPr>
-      <w:r>
-        <w:rPr>
-          <w:rFonts w:ascii="微软雅黑" w:hAnsi="微软雅黑" w:eastAsia="微软雅黑"/>
-          <w:b w:val="0"/>
-          <w:color w:val="5A5A5A"/>
-          <w:sz w:val="18"/>
-        </w:rPr>
-        <w:t>图5 AI 基础设施安全与性能挑战</w:t>
-      </w:r>
-    </w:p>
-    <w:p>
-      <w:pPr>
-        <w:spacing w:after="120" w:line="300" w:lineRule="auto"/>
-      </w:pPr>
-      <w:r>
-        <w:rPr>
-          <w:rFonts w:ascii="微软雅黑" w:hAnsi="微软雅黑" w:eastAsia="微软雅黑"/>
-          <w:b w:val="0"/>
-          <w:sz w:val="22"/>
-        </w:rPr>
-        <w:t>数据访问远贵于计算，瓶颈在内存墙与互联。</w:t>
-      </w:r>
-    </w:p>
-    <w:p>
-      <w:pPr>
         <w:jc w:val="center"/>
       </w:pPr>
       <w:r>
@@ -834,15 +889,15 @@
     </w:p>
     <w:p>
       <w:pPr>
-        <w:spacing w:after="120" w:line="300" w:lineRule="auto"/>
+        <w:spacing w:after="200" w:line="300" w:lineRule="auto"/>
       </w:pPr>
       <w:r>
         <w:rPr>
           <w:rFonts w:ascii="微软雅黑" w:hAnsi="微软雅黑" w:eastAsia="微软雅黑"/>
           <w:b w:val="0"/>
-          <w:sz w:val="22"/>
+          <w:sz w:val="20"/>
         </w:rPr>
-        <w:t>CIPU DPU 模式支撑弹性并池与 MicroVM 隔离。</w:t>
+        <w:t>佐证说明：CIPU DPU 模式支撑弹性并池与 MicroVM 隔离。</w:t>
       </w:r>
     </w:p>
     <w:p>
@@ -900,15 +955,15 @@
     </w:p>
     <w:p>
       <w:pPr>
-        <w:spacing w:after="120" w:line="300" w:lineRule="auto"/>
+        <w:spacing w:after="200" w:line="300" w:lineRule="auto"/>
       </w:pPr>
       <w:r>
         <w:rPr>
           <w:rFonts w:ascii="微软雅黑" w:hAnsi="微软雅黑" w:eastAsia="微软雅黑"/>
           <w:b w:val="0"/>
-          <w:sz w:val="22"/>
+          <w:sz w:val="20"/>
         </w:rPr>
-        <w:t>大模型权重安全是云厂商业务红线。</w:t>
+        <w:t>佐证说明：大模型权重安全是云厂商业务红线。</w:t>
       </w:r>
     </w:p>
     <w:p>
@@ -966,15 +1021,15 @@
     </w:p>
     <w:p>
       <w:pPr>
-        <w:spacing w:after="120" w:line="300" w:lineRule="auto"/>
+        <w:spacing w:after="200" w:line="300" w:lineRule="auto"/>
       </w:pPr>
       <w:r>
         <w:rPr>
           <w:rFonts w:ascii="微软雅黑" w:hAnsi="微软雅黑" w:eastAsia="微软雅黑"/>
           <w:b w:val="0"/>
-          <w:sz w:val="22"/>
+          <w:sz w:val="20"/>
         </w:rPr>
-        <w:t>VSC / NVMe KV / OSS GDS over eRDMA。</w:t>
+        <w:t>佐证说明：VSC / NVMe KV / OSS GDS over eRDMA。</w:t>
       </w:r>
     </w:p>
     <w:p>
@@ -1032,15 +1087,15 @@
     </w:p>
     <w:p>
       <w:pPr>
-        <w:spacing w:after="120" w:line="300" w:lineRule="auto"/>
+        <w:spacing w:after="200" w:line="300" w:lineRule="auto"/>
       </w:pPr>
       <w:r>
         <w:rPr>
           <w:rFonts w:ascii="微软雅黑" w:hAnsi="微软雅黑" w:eastAsia="微软雅黑"/>
           <w:b w:val="0"/>
-          <w:sz w:val="22"/>
+          <w:sz w:val="20"/>
         </w:rPr>
-        <w:t>SACK、多路径喷洒、Over VPC 等关键能力。</w:t>
+        <w:t>佐证说明：SACK、多路径喷洒、Over VPC 等关键能力。</w:t>
       </w:r>
     </w:p>
     <w:p>
@@ -1053,7 +1108,7 @@
           <w:b/>
           <w:sz w:val="26"/>
         </w:rPr>
-        <w:t>五、结论与启示</w:t>
+        <w:t>四、结论与启示</w:t>
       </w:r>
     </w:p>
     <w:p>

</xml_diff>

<commit_message>
Refocus session notes on tech depth and future insights for PPT
Enrich each talk with technical mechanisms/numbers, structured future
insights, and PPT page hooks; add a cross-forum insight outline doc.

Co-authored-by: Annie <Annie-Summer@users.noreply.github.com>
</commit_message>
<xml_diff>
--- a/yunqi-2026-cipu-forum/docs/01-CIPU技术深度解读-杨航.docx
+++ b/yunqi-2026-cipu-forum/docs/01-CIPU技术深度解读-杨航.docx
@@ -82,6 +82,19 @@
     </w:p>
     <w:p>
       <w:pPr>
+        <w:spacing w:after="120" w:line="300" w:lineRule="auto"/>
+      </w:pPr>
+      <w:r>
+        <w:rPr>
+          <w:rFonts w:ascii="微软雅黑" w:hAnsi="微软雅黑" w:eastAsia="微软雅黑"/>
+          <w:b/>
+          <w:sz w:val="20"/>
+        </w:rPr>
+        <w:t>文档定位：偏技术细节与未来启示，可作为后续洞察PPT的素材底稿。</w:t>
+      </w:r>
+    </w:p>
+    <w:p>
+      <w:pPr>
         <w:pStyle w:val="Heading2"/>
       </w:pPr>
       <w:r>
@@ -90,7 +103,7 @@
           <w:b/>
           <w:sz w:val="26"/>
         </w:rPr>
-        <w:t>一、内容摘要</w:t>
+        <w:t>一、议题速览</w:t>
       </w:r>
     </w:p>
     <w:p>
@@ -103,7 +116,7 @@
           <w:b w:val="0"/>
           <w:sz w:val="22"/>
         </w:rPr>
-        <w:t>本场由杨航系统解读 CIPU（Cloud Infrastructure Processor）在 AI 云基础设施中的定位与技术演进。核心主张是把原 Dom0 的存储与网络 IO 卸载到专用硬件，强化多租安全隔离并加速数据访问。CIPU 已完成五代演进，网络从 2×10GbE 提升到第五代 2×200GbE，并叠加 VPC/EBS/eRDMA/CPFS 硬件加速与 TPM。面向 Agent、GPU 裸金属多租、推理存储与训练网络，分别给出 MicroVM/DPU 模式、八项安全底线、VSC/NVMe KV/OSS GDS over eRDMA，以及 RC 兼容、SACK、多路径喷洒与 Over VPC 等能力。</w:t>
+        <w:t>CIPU 把原 Dom0 的存储/网络 IO 卸载到专用硬件：一边做多租安全隔离，一边做数据访问加速。五代演进到 2×200GbE，叠加 VPC/EBS/eRDMA/CPFS 卸载与 TPM。对 Agent、GPU 裸金属、推理存储、训练网络分别给出可落地的隔离与数据面路径。</w:t>
       </w:r>
     </w:p>
     <w:p>
@@ -116,7 +129,7 @@
           <w:b/>
           <w:sz w:val="26"/>
         </w:rPr>
-        <w:t>二、核心要点</w:t>
+        <w:t>二、关键技术细节速览</w:t>
       </w:r>
     </w:p>
     <w:p>
@@ -130,7 +143,7 @@
           <w:b w:val="0"/>
           <w:sz w:val="22"/>
         </w:rPr>
-        <w:t>CIPU 定位：多租安全隔离增强 + 数据访问硬件加速。</w:t>
+        <w:t>架构本质：Host OS Dom0 → CIPU Hypervisor + 硬件直通 IO 虚拟化；卸载 Management/VPC/EBS/CPFS/eRDMA/Local disks。</w:t>
       </w:r>
     </w:p>
     <w:p>
@@ -144,7 +157,7 @@
           <w:b w:val="0"/>
           <w:sz w:val="22"/>
         </w:rPr>
-        <w:t>传统 KVM 的 Dom0 IO 下沉到 CIPU，Host 侧为 CIPU Hypervisor，实现硬件直通 IO 虚拟化。</w:t>
+        <w:t>五代带宽：2×10 → 2×25 → 2×50（VPC 加速）→ 2×100（eRDMA/EBS）→ 2×200GbE（CPFS + 加解密 + TPM）。</w:t>
       </w:r>
     </w:p>
     <w:p>
@@ -158,7 +171,7 @@
           <w:b w:val="0"/>
           <w:sz w:val="22"/>
         </w:rPr>
-        <w:t>五代演进：2017 2×10GbE → 2018 2×25GbE → 2019 2×50GbE（VPC 加速）→ 2022 2×100GbE（eRDMA/EBS）→ 2024 第五代 2×200GbE（CPFS 加速、加解密、TPM）。</w:t>
+        <w:t>瓶颈转移：DRAM ~1300 pJ/op vs Int Add ~0.03 pJ/op → 内存墙与跨机互联/存储成为关键路径。</w:t>
       </w:r>
     </w:p>
     <w:p>
@@ -172,7 +185,7 @@
           <w:b w:val="0"/>
           <w:sz w:val="22"/>
         </w:rPr>
-        <w:t>AI 语境强调多租安全是底线，并引用 Agent 沙箱逃逸与 Neocloud 安全不足作为背景。</w:t>
+        <w:t>Agent：一方 Sandbox（E2B/K8s）与 Firecracker/gVisor/Kata 并池；CIPU DPU 模式支撑设备虚拟化、控制面时延与 IO 休眠唤醒。</w:t>
       </w:r>
     </w:p>
     <w:p>
@@ -186,7 +199,7 @@
           <w:b w:val="0"/>
           <w:sz w:val="22"/>
         </w:rPr>
-        <w:t>能耗视角：DRAM 访问能量远高于算力操作，瓶颈转向内存墙与跨服务器互联/存储。</w:t>
+        <w:t>GPU 裸金属八项底线：BIOS/BMC 固件、带外隔离、DDR/GPU memory 重置、DPU 安全域、TPM 等。</w:t>
       </w:r>
     </w:p>
     <w:p>
@@ -200,7 +213,7 @@
           <w:b w:val="0"/>
           <w:sz w:val="22"/>
         </w:rPr>
-        <w:t>Agent 基础设施：一方/三方 Sandbox 并池；弹性裸金属 + CIPU DPU 模式支撑 MicroVM 强隔离。</w:t>
+        <w:t>推理三路径：VSC（CPFS EFC→VSC Agent）、NVMe KV Command Set、OSS GDS over eRDMA（overlay RDMA 穿云 LB）。</w:t>
       </w:r>
     </w:p>
     <w:p>
@@ -214,7 +227,46 @@
           <w:b w:val="0"/>
           <w:sz w:val="22"/>
         </w:rPr>
-        <w:t>GPU 裸金属多租八项底线：BIOS/BMC、带外隔离、DDR/GPU memory 重置、DPU 安全域、TPM 等。</w:t>
+        <w:t>训练网络：NCCL/IBGDA/deep-ep RC 兼容；SACK 在 5% 丢包约 90% goodput；多路径喷洒缓解 ECMP 冲突、有效带宽约 +60%；Over VPC。</w:t>
+      </w:r>
+    </w:p>
+    <w:p>
+      <w:pPr>
+        <w:pStyle w:val="Heading2"/>
+      </w:pPr>
+      <w:r>
+        <w:rPr>
+          <w:rFonts w:ascii="微软雅黑" w:hAnsi="微软雅黑" w:eastAsia="微软雅黑"/>
+          <w:b/>
+          <w:sz w:val="26"/>
+        </w:rPr>
+        <w:t>三、技术展开与PPT佐证</w:t>
+      </w:r>
+    </w:p>
+    <w:p>
+      <w:pPr>
+        <w:spacing w:after="120" w:line="300" w:lineRule="auto"/>
+      </w:pPr>
+      <w:r>
+        <w:rPr>
+          <w:rFonts w:ascii="微软雅黑" w:hAnsi="微软雅黑" w:eastAsia="微软雅黑"/>
+          <w:b w:val="0"/>
+          <w:sz w:val="20"/>
+        </w:rPr>
+        <w:t>以下按技术主题展开；每节要点之后立即附上对应 PPT 截图。</w:t>
+      </w:r>
+    </w:p>
+    <w:p>
+      <w:pPr>
+        <w:spacing w:after="80" w:line="300" w:lineRule="auto"/>
+      </w:pPr>
+      <w:r>
+        <w:rPr>
+          <w:rFonts w:ascii="微软雅黑" w:hAnsi="微软雅黑" w:eastAsia="微软雅黑"/>
+          <w:b/>
+          <w:sz w:val="24"/>
+        </w:rPr>
+        <w:t>1. 架构定位：Dom0 卸载与硬件直通</w:t>
       </w:r>
     </w:p>
     <w:p>
@@ -228,7 +280,7 @@
           <w:b w:val="0"/>
           <w:sz w:val="22"/>
         </w:rPr>
-        <w:t>推理存储三路径：VSC、NVMe KV Command Set、OSS GDS over eRDMA（宣称 overlay RDMA 穿透云 LB）。</w:t>
+        <w:t>云计算六大价值中，弹性+多租是业务定义；无多租安全隔离则其他价值归零。</w:t>
       </w:r>
     </w:p>
     <w:p>
@@ -242,7 +294,7 @@
           <w:b w:val="0"/>
           <w:sz w:val="22"/>
         </w:rPr>
-        <w:t>训练网络：RC 生态兼容、SACK（5% 丢包约 90% goodput）、多路径喷洒（有效带宽约 +60%）、Over VPC。</w:t>
+        <w:t>传统 KVM：存储/网络 IO 在 Host OS Dom0；CIPU：Dom0 下沉，Host 侧为 CIPU Hypervisor。</w:t>
       </w:r>
     </w:p>
     <w:p>
@@ -256,60 +308,7 @@
           <w:b w:val="0"/>
           <w:sz w:val="22"/>
         </w:rPr>
-        <w:t>大模型权重等高价值资产的多租隔离被定义为严肃云厂商业务红线。</w:t>
-      </w:r>
-    </w:p>
-    <w:p>
-      <w:pPr>
-        <w:pStyle w:val="Heading2"/>
-      </w:pPr>
-      <w:r>
-        <w:rPr>
-          <w:rFonts w:ascii="微软雅黑" w:hAnsi="微软雅黑" w:eastAsia="微软雅黑"/>
-          <w:b/>
-          <w:sz w:val="26"/>
-        </w:rPr>
-        <w:t>三、分节梳理与PPT佐证</w:t>
-      </w:r>
-    </w:p>
-    <w:p>
-      <w:pPr>
-        <w:spacing w:after="120" w:line="300" w:lineRule="auto"/>
-      </w:pPr>
-      <w:r>
-        <w:rPr>
-          <w:rFonts w:ascii="微软雅黑" w:hAnsi="微软雅黑" w:eastAsia="微软雅黑"/>
-          <w:b w:val="0"/>
-          <w:sz w:val="20"/>
-        </w:rPr>
-        <w:t>以下按议题结构展开；每节文字要点之后立即附上对应 PPT 截图作为佐证。</w:t>
-      </w:r>
-    </w:p>
-    <w:p>
-      <w:pPr>
-        <w:spacing w:after="80" w:line="300" w:lineRule="auto"/>
-      </w:pPr>
-      <w:r>
-        <w:rPr>
-          <w:rFonts w:ascii="微软雅黑" w:hAnsi="微软雅黑" w:eastAsia="微软雅黑"/>
-          <w:b/>
-          <w:sz w:val="24"/>
-        </w:rPr>
-        <w:t>嘉宾与开场</w:t>
-      </w:r>
-    </w:p>
-    <w:p>
-      <w:pPr>
-        <w:pStyle w:val="ListBullet"/>
-        <w:spacing w:after="60"/>
-      </w:pPr>
-      <w:r>
-        <w:rPr>
-          <w:rFonts w:ascii="微软雅黑" w:hAnsi="微软雅黑" w:eastAsia="微软雅黑"/>
-          <w:b w:val="0"/>
-          <w:sz w:val="22"/>
-        </w:rPr>
-        <w:t>本场开场确认讲者身份与议题。</w:t>
+        <w:t>卸载面：Management / VPC / EBS / CPFS / eRDMA / Local disks；目标=多租隔离增强 + 数据访问硬件加速。</w:t>
       </w:r>
     </w:p>
     <w:p>
@@ -328,118 +327,11 @@
               <a:graphicData uri="http://schemas.openxmlformats.org/drawingml/2006/picture">
                 <pic:pic>
                   <pic:nvPicPr>
-                    <pic:cNvPr id="0" name="t00-02-07.png"/>
+                    <pic:cNvPr id="0" name="t00-07-30.png"/>
                     <pic:cNvPicPr/>
                   </pic:nvPicPr>
                   <pic:blipFill>
                     <a:blip r:embed="rId9"/>
-                    <a:stretch>
-                      <a:fillRect/>
-                    </a:stretch>
-                  </pic:blipFill>
-                  <pic:spPr>
-                    <a:xfrm>
-                      <a:off x="0" y="0"/>
-                      <a:ext cx="5303520" cy="2524814"/>
-                    </a:xfrm>
-                    <a:prstGeom prst="rect"/>
-                  </pic:spPr>
-                </pic:pic>
-              </a:graphicData>
-            </a:graphic>
-          </wp:inline>
-        </w:drawing>
-      </w:r>
-    </w:p>
-    <w:p>
-      <w:pPr>
-        <w:jc w:val="center"/>
-      </w:pPr>
-      <w:r>
-        <w:rPr>
-          <w:rFonts w:ascii="微软雅黑" w:hAnsi="微软雅黑" w:eastAsia="微软雅黑"/>
-          <w:b w:val="0"/>
-          <w:color w:val="5A5A5A"/>
-          <w:sz w:val="18"/>
-        </w:rPr>
-        <w:t>图1 嘉宾介绍：杨航 / Hang Yang</w:t>
-      </w:r>
-    </w:p>
-    <w:p>
-      <w:pPr>
-        <w:spacing w:after="200" w:line="300" w:lineRule="auto"/>
-      </w:pPr>
-      <w:r>
-        <w:rPr>
-          <w:rFonts w:ascii="微软雅黑" w:hAnsi="微软雅黑" w:eastAsia="微软雅黑"/>
-          <w:b w:val="0"/>
-          <w:sz w:val="20"/>
-        </w:rPr>
-        <w:t>佐证说明：确认讲者身份与开场时间。</w:t>
-      </w:r>
-    </w:p>
-    <w:p>
-      <w:pPr>
-        <w:spacing w:after="80" w:line="300" w:lineRule="auto"/>
-      </w:pPr>
-      <w:r>
-        <w:rPr>
-          <w:rFonts w:ascii="微软雅黑" w:hAnsi="微软雅黑" w:eastAsia="微软雅黑"/>
-          <w:b/>
-          <w:sz w:val="24"/>
-        </w:rPr>
-        <w:t>1. CIPU 业务定位与架构对比</w:t>
-      </w:r>
-    </w:p>
-    <w:p>
-      <w:pPr>
-        <w:pStyle w:val="ListBullet"/>
-        <w:spacing w:after="60"/>
-      </w:pPr>
-      <w:r>
-        <w:rPr>
-          <w:rFonts w:ascii="微软雅黑" w:hAnsi="微软雅黑" w:eastAsia="微软雅黑"/>
-          <w:b w:val="0"/>
-          <w:sz w:val="22"/>
-        </w:rPr>
-        <w:t>云计算六大价值：弹性、多租、安全、稳定、性能、成本。</w:t>
-      </w:r>
-    </w:p>
-    <w:p>
-      <w:pPr>
-        <w:pStyle w:val="ListBullet"/>
-        <w:spacing w:after="60"/>
-      </w:pPr>
-      <w:r>
-        <w:rPr>
-          <w:rFonts w:ascii="微软雅黑" w:hAnsi="微软雅黑" w:eastAsia="微软雅黑"/>
-          <w:b w:val="0"/>
-          <w:sz w:val="22"/>
-        </w:rPr>
-        <w:t>从 Host OS Dom0 卸载到 CIPU：Management / VPC / EBS / CPFS / eRDMA / Local disks。</w:t>
-      </w:r>
-    </w:p>
-    <w:p>
-      <w:pPr>
-        <w:jc w:val="center"/>
-      </w:pPr>
-      <w:r>
-        <w:drawing>
-          <wp:inline xmlns:a="http://schemas.openxmlformats.org/drawingml/2006/main" xmlns:pic="http://schemas.openxmlformats.org/drawingml/2006/picture">
-            <wp:extent cx="5303520" cy="2524814"/>
-            <wp:docPr id="2" name="Picture 2"/>
-            <wp:cNvGraphicFramePr>
-              <a:graphicFrameLocks noChangeAspect="1"/>
-            </wp:cNvGraphicFramePr>
-            <a:graphic>
-              <a:graphicData uri="http://schemas.openxmlformats.org/drawingml/2006/picture">
-                <pic:pic>
-                  <pic:nvPicPr>
-                    <pic:cNvPr id="0" name="t00-07-30.png"/>
-                    <pic:cNvPicPr/>
-                  </pic:nvPicPr>
-                  <pic:blipFill>
-                    <a:blip r:embed="rId10"/>
                     <a:stretch>
                       <a:fillRect/>
                     </a:stretch>
@@ -493,7 +385,7 @@
         <w:drawing>
           <wp:inline xmlns:a="http://schemas.openxmlformats.org/drawingml/2006/main" xmlns:pic="http://schemas.openxmlformats.org/drawingml/2006/picture">
             <wp:extent cx="5303520" cy="2524814"/>
-            <wp:docPr id="3" name="Picture 3"/>
+            <wp:docPr id="2" name="Picture 2"/>
             <wp:cNvGraphicFramePr>
               <a:graphicFrameLocks noChangeAspect="1"/>
             </wp:cNvGraphicFramePr>
@@ -505,7 +397,7 @@
                     <pic:cNvPicPr/>
                   </pic:nvPicPr>
                   <pic:blipFill>
-                    <a:blip r:embed="rId11"/>
+                    <a:blip r:embed="rId10"/>
                     <a:stretch>
                       <a:fillRect/>
                     </a:stretch>
@@ -561,7 +453,7 @@
           <w:b/>
           <w:sz w:val="24"/>
         </w:rPr>
-        <w:t>2. 五代演进</w:t>
+        <w:t>2. 五代演进与能力叠加</w:t>
       </w:r>
     </w:p>
     <w:p>
@@ -575,7 +467,7 @@
           <w:b w:val="0"/>
           <w:sz w:val="22"/>
         </w:rPr>
-        <w:t>带宽与卸载能力围绕云核心价值持续迭代。</w:t>
+        <w:t>2017 2×10GbE：弹性裸金属、安全容器 → 2018 2×25GbE：裸金属与 VM 并池。</w:t>
       </w:r>
     </w:p>
     <w:p>
@@ -589,7 +481,21 @@
           <w:b w:val="0"/>
           <w:sz w:val="22"/>
         </w:rPr>
-        <w:t>第五代重点：CPFS、EBS/VPC 加解密、TPM、2×200GbE。</w:t>
+        <w:t>2019 2×50GbE：VPC 硬件加速 → 2022 2×100GbE：eRDMA、EBS 硬件加速。</w:t>
+      </w:r>
+    </w:p>
+    <w:p>
+      <w:pPr>
+        <w:pStyle w:val="ListBullet"/>
+        <w:spacing w:after="60"/>
+      </w:pPr>
+      <w:r>
+        <w:rPr>
+          <w:rFonts w:ascii="微软雅黑" w:hAnsi="微软雅黑" w:eastAsia="微软雅黑"/>
+          <w:b w:val="0"/>
+          <w:sz w:val="22"/>
+        </w:rPr>
+        <w:t>2024 第五代 2×200GbE：CPFS 硬件加速、EBS/VPC 数据加解密、TPM 可信计算——当前 AI Infra 硬件基线。</w:t>
       </w:r>
     </w:p>
     <w:p>
@@ -600,7 +506,7 @@
         <w:drawing>
           <wp:inline xmlns:a="http://schemas.openxmlformats.org/drawingml/2006/main" xmlns:pic="http://schemas.openxmlformats.org/drawingml/2006/picture">
             <wp:extent cx="5303520" cy="2524814"/>
-            <wp:docPr id="4" name="Picture 4"/>
+            <wp:docPr id="3" name="Picture 3"/>
             <wp:cNvGraphicFramePr>
               <a:graphicFrameLocks noChangeAspect="1"/>
             </wp:cNvGraphicFramePr>
@@ -612,7 +518,7 @@
                     <pic:cNvPicPr/>
                   </pic:nvPicPr>
                   <pic:blipFill>
-                    <a:blip r:embed="rId12"/>
+                    <a:blip r:embed="rId11"/>
                     <a:stretch>
                       <a:fillRect/>
                     </a:stretch>
@@ -668,7 +574,7 @@
           <w:b/>
           <w:sz w:val="24"/>
         </w:rPr>
-        <w:t>AI 安全与性能挑战</w:t>
+        <w:t>3. 安全与性能：为何数据访问成为瓶颈</w:t>
       </w:r>
     </w:p>
     <w:p>
@@ -682,7 +588,7 @@
           <w:b w:val="0"/>
           <w:sz w:val="22"/>
         </w:rPr>
-        <w:t>AI 语境强调多租安全是底线，并引用 Agent 沙箱逃逸与 Neocloud 安全不足作为背景。</w:t>
+        <w:t>背景事件：Agent 沙箱逃逸、SemiAnalysis「Most Neoclouds Suck At Security」——严肃云把多租安全当红线。</w:t>
       </w:r>
     </w:p>
     <w:p>
@@ -696,7 +602,21 @@
           <w:b w:val="0"/>
           <w:sz w:val="22"/>
         </w:rPr>
-        <w:t>能耗视角：DRAM 访问能量远高于算力操作，瓶颈转向内存墙与跨服务器互联/存储。</w:t>
+        <w:t>能耗/性能叙事：算力相对廉价，DRAM 访问与跨服务器互联昂贵 → 内存墙 + 存储/网络路径决定体验与成本。</w:t>
+      </w:r>
+    </w:p>
+    <w:p>
+      <w:pPr>
+        <w:pStyle w:val="ListBullet"/>
+        <w:spacing w:after="60"/>
+      </w:pPr>
+      <w:r>
+        <w:rPr>
+          <w:rFonts w:ascii="微软雅黑" w:hAnsi="微软雅黑" w:eastAsia="微软雅黑"/>
+          <w:b w:val="0"/>
+          <w:sz w:val="22"/>
+        </w:rPr>
+        <w:t>含义：CIPU 价值不在「更大带宽」 alone，而在把隔离与数据面加速做成平台能力。</w:t>
       </w:r>
     </w:p>
     <w:p>
@@ -707,7 +627,7 @@
         <w:drawing>
           <wp:inline xmlns:a="http://schemas.openxmlformats.org/drawingml/2006/main" xmlns:pic="http://schemas.openxmlformats.org/drawingml/2006/picture">
             <wp:extent cx="5303520" cy="2524814"/>
-            <wp:docPr id="5" name="Picture 5"/>
+            <wp:docPr id="4" name="Picture 4"/>
             <wp:cNvGraphicFramePr>
               <a:graphicFrameLocks noChangeAspect="1"/>
             </wp:cNvGraphicFramePr>
@@ -719,7 +639,7 @@
                     <pic:cNvPicPr/>
                   </pic:nvPicPr>
                   <pic:blipFill>
-                    <a:blip r:embed="rId13"/>
+                    <a:blip r:embed="rId12"/>
                     <a:stretch>
                       <a:fillRect/>
                     </a:stretch>
@@ -775,7 +695,7 @@
           <w:b/>
           <w:sz w:val="24"/>
         </w:rPr>
-        <w:t>3. 面向 Agent / GPU / 推理 / 训练</w:t>
+        <w:t>4. Agent / GPU 裸金属：隔离如何落到固件与内存</w:t>
       </w:r>
     </w:p>
     <w:p>
@@ -789,7 +709,7 @@
           <w:b w:val="0"/>
           <w:sz w:val="22"/>
         </w:rPr>
-        <w:t>Agent：Sandbox 并池 + MicroVM + DPU 模式。</w:t>
+        <w:t>Agent：一方与三方 sandbox 并池；MicroVM 强隔离；CIPU DPU 模式支撑高密度控制面与设备虚拟化。</w:t>
       </w:r>
     </w:p>
     <w:p>
@@ -803,7 +723,7 @@
           <w:b w:val="0"/>
           <w:sz w:val="22"/>
         </w:rPr>
-        <w:t>GPU 裸金属：固件到内存重置的八项硬要求。</w:t>
+        <w:t>GPU 裸金属八项：Host BIOS/BMC 固件安全、BMC 带外/带内隔离、多租切换 DDR 与 GPU memory 重置、DPU/CIPU 安全域与升级隔离、TPM。</w:t>
       </w:r>
     </w:p>
     <w:p>
@@ -817,21 +737,7 @@
           <w:b w:val="0"/>
           <w:sz w:val="22"/>
         </w:rPr>
-        <w:t>推理：VSC / NVMe KV / OSS GDS 多租高速通道。</w:t>
-      </w:r>
-    </w:p>
-    <w:p>
-      <w:pPr>
-        <w:pStyle w:val="ListBullet"/>
-        <w:spacing w:after="60"/>
-      </w:pPr>
-      <w:r>
-        <w:rPr>
-          <w:rFonts w:ascii="微软雅黑" w:hAnsi="微软雅黑" w:eastAsia="微软雅黑"/>
-          <w:b w:val="0"/>
-          <w:sz w:val="22"/>
-        </w:rPr>
-        <w:t>训练：RC + SACK + 喷洒 + Over VPC。</w:t>
+        <w:t>大模型权重等高价值资产的多租隔离被定义为严肃云厂商业务红线。</w:t>
       </w:r>
     </w:p>
     <w:p>
@@ -842,7 +748,7 @@
         <w:drawing>
           <wp:inline xmlns:a="http://schemas.openxmlformats.org/drawingml/2006/main" xmlns:pic="http://schemas.openxmlformats.org/drawingml/2006/picture">
             <wp:extent cx="5303520" cy="2524814"/>
-            <wp:docPr id="6" name="Picture 6"/>
+            <wp:docPr id="5" name="Picture 5"/>
             <wp:cNvGraphicFramePr>
               <a:graphicFrameLocks noChangeAspect="1"/>
             </wp:cNvGraphicFramePr>
@@ -854,7 +760,7 @@
                     <pic:cNvPicPr/>
                   </pic:nvPicPr>
                   <pic:blipFill>
-                    <a:blip r:embed="rId14"/>
+                    <a:blip r:embed="rId13"/>
                     <a:stretch>
                       <a:fillRect/>
                     </a:stretch>
@@ -908,7 +814,7 @@
         <w:drawing>
           <wp:inline xmlns:a="http://schemas.openxmlformats.org/drawingml/2006/main" xmlns:pic="http://schemas.openxmlformats.org/drawingml/2006/picture">
             <wp:extent cx="5303520" cy="2524814"/>
-            <wp:docPr id="7" name="Picture 7"/>
+            <wp:docPr id="6" name="Picture 6"/>
             <wp:cNvGraphicFramePr>
               <a:graphicFrameLocks noChangeAspect="1"/>
             </wp:cNvGraphicFramePr>
@@ -920,7 +826,7 @@
                     <pic:cNvPicPr/>
                   </pic:nvPicPr>
                   <pic:blipFill>
-                    <a:blip r:embed="rId15"/>
+                    <a:blip r:embed="rId14"/>
                     <a:stretch>
                       <a:fillRect/>
                     </a:stretch>
@@ -968,13 +874,68 @@
     </w:p>
     <w:p>
       <w:pPr>
+        <w:spacing w:after="80" w:line="300" w:lineRule="auto"/>
+      </w:pPr>
+      <w:r>
+        <w:rPr>
+          <w:rFonts w:ascii="微软雅黑" w:hAnsi="微软雅黑" w:eastAsia="微软雅黑"/>
+          <w:b/>
+          <w:sz w:val="24"/>
+        </w:rPr>
+        <w:t>5. 推理存储与训练网络：数据面具体路径</w:t>
+      </w:r>
+    </w:p>
+    <w:p>
+      <w:pPr>
+        <w:pStyle w:val="ListBullet"/>
+        <w:spacing w:after="60"/>
+      </w:pPr>
+      <w:r>
+        <w:rPr>
+          <w:rFonts w:ascii="微软雅黑" w:hAnsi="微软雅黑" w:eastAsia="微软雅黑"/>
+          <w:b w:val="0"/>
+          <w:sz w:val="22"/>
+        </w:rPr>
+        <w:t>推理：① VSC（CPFS EFC client→VSC Agent）② NVMe KV Command Set（KVCache store）③ OSS GDS over eRDMA。</w:t>
+      </w:r>
+    </w:p>
+    <w:p>
+      <w:pPr>
+        <w:pStyle w:val="ListBullet"/>
+        <w:spacing w:after="60"/>
+      </w:pPr>
+      <w:r>
+        <w:rPr>
+          <w:rFonts w:ascii="微软雅黑" w:hAnsi="微软雅黑" w:eastAsia="微软雅黑"/>
+          <w:b w:val="0"/>
+          <w:sz w:val="22"/>
+        </w:rPr>
+        <w:t>训练：RC 生态兼容、应用零改动；SACK 抗丢包；多路径喷洒抗大象流 ECMP hash 冲突（有效带宽约 +60%）；Over VPC 多租+柔性组网。</w:t>
+      </w:r>
+    </w:p>
+    <w:p>
+      <w:pPr>
+        <w:pStyle w:val="ListBullet"/>
+        <w:spacing w:after="60"/>
+      </w:pPr>
+      <w:r>
+        <w:rPr>
+          <w:rFonts w:ascii="微软雅黑" w:hAnsi="微软雅黑" w:eastAsia="微软雅黑"/>
+          <w:b w:val="0"/>
+          <w:sz w:val="22"/>
+        </w:rPr>
+        <w:t>与后续 KVCache/存储议题衔接：CIPU 是推理/训练数据面的硬件承载层。</w:t>
+      </w:r>
+    </w:p>
+    <w:p>
+      <w:pPr>
         <w:jc w:val="center"/>
       </w:pPr>
       <w:r>
         <w:drawing>
           <wp:inline xmlns:a="http://schemas.openxmlformats.org/drawingml/2006/main" xmlns:pic="http://schemas.openxmlformats.org/drawingml/2006/picture">
             <wp:extent cx="5303520" cy="2524814"/>
-            <wp:docPr id="8" name="Picture 8"/>
+            <wp:docPr id="7" name="Picture 7"/>
             <wp:cNvGraphicFramePr>
               <a:graphicFrameLocks noChangeAspect="1"/>
             </wp:cNvGraphicFramePr>
@@ -986,7 +947,7 @@
                     <pic:cNvPicPr/>
                   </pic:nvPicPr>
                   <pic:blipFill>
-                    <a:blip r:embed="rId16"/>
+                    <a:blip r:embed="rId15"/>
                     <a:stretch>
                       <a:fillRect/>
                     </a:stretch>
@@ -1040,7 +1001,7 @@
         <w:drawing>
           <wp:inline xmlns:a="http://schemas.openxmlformats.org/drawingml/2006/main" xmlns:pic="http://schemas.openxmlformats.org/drawingml/2006/picture">
             <wp:extent cx="5303520" cy="2524814"/>
-            <wp:docPr id="9" name="Picture 9"/>
+            <wp:docPr id="8" name="Picture 8"/>
             <wp:cNvGraphicFramePr>
               <a:graphicFrameLocks noChangeAspect="1"/>
             </wp:cNvGraphicFramePr>
@@ -1052,7 +1013,7 @@
                     <pic:cNvPicPr/>
                   </pic:nvPicPr>
                   <pic:blipFill>
-                    <a:blip r:embed="rId17"/>
+                    <a:blip r:embed="rId16"/>
                     <a:stretch>
                       <a:fillRect/>
                     </a:stretch>
@@ -1108,7 +1069,33 @@
           <w:b/>
           <w:sz w:val="26"/>
         </w:rPr>
-        <w:t>四、结论与启示</w:t>
+        <w:t>四、面向未来的洞察（洞察PPT素材）</w:t>
+      </w:r>
+    </w:p>
+    <w:p>
+      <w:pPr>
+        <w:spacing w:after="120" w:line="300" w:lineRule="auto"/>
+      </w:pPr>
+      <w:r>
+        <w:rPr>
+          <w:rFonts w:ascii="微软雅黑" w:hAnsi="微软雅黑" w:eastAsia="微软雅黑"/>
+          <w:b w:val="0"/>
+          <w:sz w:val="20"/>
+        </w:rPr>
+        <w:t>本节可直接拆成洞察PPT的判断页/动作页/金句页。</w:t>
+      </w:r>
+    </w:p>
+    <w:p>
+      <w:pPr>
+        <w:spacing w:after="80" w:line="300" w:lineRule="auto"/>
+      </w:pPr>
+      <w:r>
+        <w:rPr>
+          <w:rFonts w:ascii="微软雅黑" w:hAnsi="微软雅黑" w:eastAsia="微软雅黑"/>
+          <w:b/>
+          <w:sz w:val="24"/>
+        </w:rPr>
+        <w:t>趋势判断</w:t>
       </w:r>
     </w:p>
     <w:p>
@@ -1122,7 +1109,7 @@
           <w:b w:val="0"/>
           <w:sz w:val="22"/>
         </w:rPr>
-        <w:t>CIPU 把多租隔离与 IO/数据访问加速沉淀到硬件，而非单纯带宽升级。</w:t>
+        <w:t>AI Infra 竞争从「算力供给」转向「多租安全 + 数据访问效率」双轴。</w:t>
       </w:r>
     </w:p>
     <w:p>
@@ -1136,7 +1123,20 @@
           <w:b w:val="0"/>
           <w:sz w:val="22"/>
         </w:rPr>
-        <w:t>对 Agent/GPU 裸金属，安全底线抬高到固件、BMC、内存重置与 DPU 域隔离。</w:t>
+        <w:t>Agent/裸金属场景把安全边界下推到固件、BMC、内存重置与 DPU 域——软件沙箱不够。</w:t>
+      </w:r>
+    </w:p>
+    <w:p>
+      <w:pPr>
+        <w:spacing w:after="80" w:line="300" w:lineRule="auto"/>
+      </w:pPr>
+      <w:r>
+        <w:rPr>
+          <w:rFonts w:ascii="微软雅黑" w:hAnsi="微软雅黑" w:eastAsia="微软雅黑"/>
+          <w:b/>
+          <w:sz w:val="24"/>
+        </w:rPr>
+        <w:t>关键技术判断</w:t>
       </w:r>
     </w:p>
     <w:p>
@@ -1150,7 +1150,7 @@
           <w:b w:val="0"/>
           <w:sz w:val="22"/>
         </w:rPr>
-        <w:t>推理侧把 KVCache/CPFS/OSS 做成 CIPU 上的多租高速通道；训练侧强化 RDMA 可靠性与 ECMP 冲突治理。</w:t>
+        <w:t>DPU/CIPU 类卸载将成严肃云标配：隔离与 IO 加速必须硬件化，否则难以同时满足密度与安全。</w:t>
       </w:r>
     </w:p>
     <w:p>
@@ -1164,7 +1164,159 @@
           <w:b w:val="0"/>
           <w:sz w:val="22"/>
         </w:rPr>
-        <w:t>第五代 CIPU 是当前对标 AI Infra 的硬件基线。</w:t>
+        <w:t>推理侧 KV/对象/并行文件系统会收敛到「可多租的高速通道」形态（VSC/NVMe KV/GDS）。</w:t>
+      </w:r>
+    </w:p>
+    <w:p>
+      <w:pPr>
+        <w:pStyle w:val="ListBullet"/>
+        <w:spacing w:after="60"/>
+      </w:pPr>
+      <w:r>
+        <w:rPr>
+          <w:rFonts w:ascii="微软雅黑" w:hAnsi="微软雅黑" w:eastAsia="微软雅黑"/>
+          <w:b w:val="0"/>
+          <w:sz w:val="22"/>
+        </w:rPr>
+        <w:t>训练侧 RDMA 可靠性与 ECMP 冲突治理会成为规模化集群的隐性门槛。</w:t>
+      </w:r>
+    </w:p>
+    <w:p>
+      <w:pPr>
+        <w:spacing w:after="80" w:line="300" w:lineRule="auto"/>
+      </w:pPr>
+      <w:r>
+        <w:rPr>
+          <w:rFonts w:ascii="微软雅黑" w:hAnsi="微软雅黑" w:eastAsia="微软雅黑"/>
+          <w:b/>
+          <w:sz w:val="24"/>
+        </w:rPr>
+        <w:t>对 Infra / 平台的启示</w:t>
+      </w:r>
+    </w:p>
+    <w:p>
+      <w:pPr>
+        <w:pStyle w:val="ListBullet"/>
+        <w:spacing w:after="60"/>
+      </w:pPr>
+      <w:r>
+        <w:rPr>
+          <w:rFonts w:ascii="微软雅黑" w:hAnsi="微软雅黑" w:eastAsia="微软雅黑"/>
+          <w:b w:val="0"/>
+          <w:sz w:val="22"/>
+        </w:rPr>
+        <w:t>选型/自建：评估 neocloud 时应用「八项底线」做安全清单，而非只看卡数与单价。</w:t>
+      </w:r>
+    </w:p>
+    <w:p>
+      <w:pPr>
+        <w:pStyle w:val="ListBullet"/>
+        <w:spacing w:after="60"/>
+      </w:pPr>
+      <w:r>
+        <w:rPr>
+          <w:rFonts w:ascii="微软雅黑" w:hAnsi="微软雅黑" w:eastAsia="微软雅黑"/>
+          <w:b w:val="0"/>
+          <w:sz w:val="22"/>
+        </w:rPr>
+        <w:t>架构：把 KVCache、CPFS、OSS 路径与 CIPU/DPU 能力对齐，避免引擎侧优化被数据面拖垮。</w:t>
+      </w:r>
+    </w:p>
+    <w:p>
+      <w:pPr>
+        <w:pStyle w:val="ListBullet"/>
+        <w:spacing w:after="60"/>
+      </w:pPr>
+      <w:r>
+        <w:rPr>
+          <w:rFonts w:ascii="微软雅黑" w:hAnsi="微软雅黑" w:eastAsia="微软雅黑"/>
+          <w:b w:val="0"/>
+          <w:sz w:val="22"/>
+        </w:rPr>
+        <w:t>演进：关注 200GbE+ 代际上的加解密、TPM、CPFS 卸载是否成为默认能力。</w:t>
+      </w:r>
+    </w:p>
+    <w:p>
+      <w:pPr>
+        <w:spacing w:after="80" w:line="300" w:lineRule="auto"/>
+      </w:pPr>
+      <w:r>
+        <w:rPr>
+          <w:rFonts w:ascii="微软雅黑" w:hAnsi="微软雅黑" w:eastAsia="微软雅黑"/>
+          <w:b/>
+          <w:sz w:val="24"/>
+        </w:rPr>
+        <w:t>洞察PPT页建议（可直接拆页）</w:t>
+      </w:r>
+    </w:p>
+    <w:p>
+      <w:pPr>
+        <w:pStyle w:val="ListBullet"/>
+        <w:spacing w:after="60"/>
+      </w:pPr>
+      <w:r>
+        <w:rPr>
+          <w:rFonts w:ascii="微软雅黑" w:hAnsi="微软雅黑" w:eastAsia="微软雅黑"/>
+          <w:b w:val="0"/>
+          <w:sz w:val="22"/>
+        </w:rPr>
+        <w:t>页建议：Dom0→CIPU 架构对比图（一图讲清卸载面）。</w:t>
+      </w:r>
+    </w:p>
+    <w:p>
+      <w:pPr>
+        <w:pStyle w:val="ListBullet"/>
+        <w:spacing w:after="60"/>
+      </w:pPr>
+      <w:r>
+        <w:rPr>
+          <w:rFonts w:ascii="微软雅黑" w:hAnsi="微软雅黑" w:eastAsia="微软雅黑"/>
+          <w:b w:val="0"/>
+          <w:sz w:val="22"/>
+        </w:rPr>
+        <w:t>页建议：五代演进时间线 + 第五代能力清单。</w:t>
+      </w:r>
+    </w:p>
+    <w:p>
+      <w:pPr>
+        <w:pStyle w:val="ListBullet"/>
+        <w:spacing w:after="60"/>
+      </w:pPr>
+      <w:r>
+        <w:rPr>
+          <w:rFonts w:ascii="微软雅黑" w:hAnsi="微软雅黑" w:eastAsia="微软雅黑"/>
+          <w:b w:val="0"/>
+          <w:sz w:val="22"/>
+        </w:rPr>
+        <w:t>页建议：GPU 裸金属八项安全底线 Checklist。</w:t>
+      </w:r>
+    </w:p>
+    <w:p>
+      <w:pPr>
+        <w:pStyle w:val="ListBullet"/>
+        <w:spacing w:after="60"/>
+      </w:pPr>
+      <w:r>
+        <w:rPr>
+          <w:rFonts w:ascii="微软雅黑" w:hAnsi="微软雅黑" w:eastAsia="微软雅黑"/>
+          <w:b w:val="0"/>
+          <w:sz w:val="22"/>
+        </w:rPr>
+        <w:t>页建议：推理三路径 / 训练四优化对照表（问题→机制→收益数字）。</w:t>
+      </w:r>
+    </w:p>
+    <w:p>
+      <w:pPr>
+        <w:pStyle w:val="ListBullet"/>
+        <w:spacing w:after="60"/>
+      </w:pPr>
+      <w:r>
+        <w:rPr>
+          <w:rFonts w:ascii="微软雅黑" w:hAnsi="微软雅黑" w:eastAsia="微软雅黑"/>
+          <w:b w:val="0"/>
+          <w:sz w:val="22"/>
+        </w:rPr>
+        <w:t>洞察金句：算力廉价、数据访问昂贵；安全是严肃云的差异化。</w:t>
       </w:r>
     </w:p>
     <w:sectPr>

</xml_diff>